<commit_message>
lots of new staff
</commit_message>
<xml_diff>
--- a/schools-presentations/A Gymnasiou/A5.2 - Ηλεκτρονικό ταχυδρομείο/A5.2 Μ3 -Φύλλο Εργασίας - Επισύναψη.docx
+++ b/schools-presentations/A Gymnasiou/A5.2 - Ηλεκτρονικό ταχυδρομείο/A5.2 Μ3 -Φύλλο Εργασίας - Επισύναψη.docx
@@ -25,53 +25,19 @@
       <w:pPr>
         <w:spacing w:after="100"/>
         <w:jc w:val="center"/>
+        <w:rPr>
+          <w:lang w:val="el-GR"/>
+        </w:rPr>
       </w:pPr>
-      <w:proofErr w:type="spellStart"/>
       <w:r>
         <w:rPr>
           <w:b/>
           <w:color w:val="000000"/>
           <w:sz w:val="26"/>
+          <w:lang w:val="el-GR"/>
         </w:rPr>
-        <w:t>Δι</w:t>
+        <w:t>Διαχείριση Ηλεκτρονικού Ταχυδρομείου</w:t>
       </w:r>
-      <w:proofErr w:type="spellEnd"/>
-      <w:r>
-        <w:rPr>
-          <w:b/>
-          <w:color w:val="000000"/>
-          <w:sz w:val="26"/>
-        </w:rPr>
-        <w:t xml:space="preserve">αχείριση </w:t>
-      </w:r>
-      <w:proofErr w:type="spellStart"/>
-      <w:r>
-        <w:rPr>
-          <w:b/>
-          <w:color w:val="000000"/>
-          <w:sz w:val="26"/>
-        </w:rPr>
-        <w:t>Ηλεκτρονικού</w:t>
-      </w:r>
-      <w:proofErr w:type="spellEnd"/>
-      <w:r>
-        <w:rPr>
-          <w:b/>
-          <w:color w:val="000000"/>
-          <w:sz w:val="26"/>
-        </w:rPr>
-        <w:t xml:space="preserve"> Τα</w:t>
-      </w:r>
-      <w:proofErr w:type="spellStart"/>
-      <w:r>
-        <w:rPr>
-          <w:b/>
-          <w:color w:val="000000"/>
-          <w:sz w:val="26"/>
-        </w:rPr>
-        <w:t>χυδρομείου</w:t>
-      </w:r>
-      <w:proofErr w:type="spellEnd"/>
     </w:p>
     <w:tbl>
       <w:tblPr>
@@ -536,7 +502,53 @@
                 <w:szCs w:val="28"/>
                 <w:lang w:val="el-GR"/>
               </w:rPr>
-              <w:t xml:space="preserve">Δημιούργησε στον φάκελό σου έναν νέο φάκελο με όνομα </w:t>
+              <w:t xml:space="preserve">Στο </w:t>
+            </w:r>
+            <w:r>
+              <w:rPr>
+                <w:b/>
+                <w:bCs/>
+                <w:sz w:val="28"/>
+                <w:szCs w:val="28"/>
+                <w:lang w:val="el-GR"/>
+              </w:rPr>
+              <w:t xml:space="preserve">δίσκο </w:t>
+            </w:r>
+            <w:r>
+              <w:rPr>
+                <w:b/>
+                <w:bCs/>
+                <w:sz w:val="28"/>
+                <w:szCs w:val="28"/>
+                <w:lang w:val="el-GR"/>
+              </w:rPr>
+              <w:t>Χ</w:t>
+            </w:r>
+            <w:r>
+              <w:rPr>
+                <w:b/>
+                <w:bCs/>
+                <w:sz w:val="28"/>
+                <w:szCs w:val="28"/>
+                <w:lang w:val="el-GR"/>
+              </w:rPr>
+              <w:t xml:space="preserve"> του υπολογιστή μας</w:t>
+            </w:r>
+            <w:r>
+              <w:rPr>
+                <w:sz w:val="28"/>
+                <w:szCs w:val="28"/>
+                <w:lang w:val="el-GR"/>
+              </w:rPr>
+              <w:t>, δ</w:t>
+            </w:r>
+            <w:r>
+              <w:rPr>
+                <w:sz w:val="28"/>
+                <w:szCs w:val="28"/>
+                <w:lang w:val="el-GR"/>
+              </w:rPr>
+              <w:t xml:space="preserve">ημιούργησε έναν νέο φάκελο με όνομα </w:t>
             </w:r>
             <w:r>
               <w:rPr>
@@ -643,7 +655,87 @@
                 <w:szCs w:val="28"/>
                 <w:lang w:val="el-GR"/>
               </w:rPr>
-              <w:t xml:space="preserve">Βρες στην ιστοσελίδα του σχολείου δύο κατάλληλες φωτογραφίες και </w:t>
+              <w:t xml:space="preserve">Άνοιξε </w:t>
+            </w:r>
+            <w:r>
+              <w:rPr>
+                <w:sz w:val="28"/>
+                <w:szCs w:val="28"/>
+                <w:lang w:val="el-GR"/>
+              </w:rPr>
+              <w:t>την ιστοσελίδα του σχολείου</w:t>
+            </w:r>
+            <w:r>
+              <w:rPr>
+                <w:sz w:val="28"/>
+                <w:szCs w:val="28"/>
+                <w:lang w:val="el-GR"/>
+              </w:rPr>
+              <w:t xml:space="preserve"> και </w:t>
+            </w:r>
+            <w:r>
+              <w:rPr>
+                <w:b/>
+                <w:bCs/>
+                <w:sz w:val="28"/>
+                <w:szCs w:val="28"/>
+                <w:lang w:val="el-GR"/>
+              </w:rPr>
+              <w:t>κατέβασε(</w:t>
+            </w:r>
+            <w:r>
+              <w:rPr>
+                <w:b/>
+                <w:bCs/>
+                <w:sz w:val="28"/>
+                <w:szCs w:val="28"/>
+              </w:rPr>
+              <w:t>save</w:t>
+            </w:r>
+            <w:r>
+              <w:rPr>
+                <w:b/>
+                <w:bCs/>
+                <w:sz w:val="28"/>
+                <w:szCs w:val="28"/>
+                <w:lang w:val="el-GR"/>
+              </w:rPr>
+              <w:t xml:space="preserve"> </w:t>
+            </w:r>
+            <w:r>
+              <w:rPr>
+                <w:b/>
+                <w:bCs/>
+                <w:sz w:val="28"/>
+                <w:szCs w:val="28"/>
+              </w:rPr>
+              <w:t>as</w:t>
+            </w:r>
+            <w:r>
+              <w:rPr>
+                <w:b/>
+                <w:bCs/>
+                <w:sz w:val="28"/>
+                <w:szCs w:val="28"/>
+                <w:lang w:val="el-GR"/>
+              </w:rPr>
+              <w:t>)</w:t>
+            </w:r>
+            <w:r>
+              <w:rPr>
+                <w:sz w:val="28"/>
+                <w:szCs w:val="28"/>
+                <w:lang w:val="el-GR"/>
+              </w:rPr>
+              <w:t xml:space="preserve"> </w:t>
+            </w:r>
+            <w:r>
+              <w:rPr>
+                <w:sz w:val="28"/>
+                <w:szCs w:val="28"/>
+                <w:lang w:val="el-GR"/>
+              </w:rPr>
+              <w:t xml:space="preserve">δύο φωτογραφίες και </w:t>
             </w:r>
             <w:r>
               <w:rPr>
@@ -772,7 +864,14 @@
                 <w:szCs w:val="28"/>
                 <w:lang w:val="el-GR"/>
               </w:rPr>
-              <w:t xml:space="preserve">Δημιούργησε μήνυμα προς τον </w:t>
+              <w:t xml:space="preserve">Άνοιξε το </w:t>
+            </w:r>
+            <w:r>
+              <w:rPr>
+                <w:sz w:val="28"/>
+                <w:szCs w:val="28"/>
+              </w:rPr>
+              <w:t>Email</w:t>
             </w:r>
             <w:r>
               <w:rPr>
@@ -780,8 +879,112 @@
                 <w:szCs w:val="28"/>
                 <w:lang w:val="el-GR"/>
               </w:rPr>
-              <w:t xml:space="preserve">καθηγητή σου </w:t>
-            </w:r>
+              <w:t xml:space="preserve"> σου και </w:t>
+            </w:r>
+            <w:r>
+              <w:rPr>
+                <w:sz w:val="28"/>
+                <w:szCs w:val="28"/>
+                <w:lang w:val="el-GR"/>
+              </w:rPr>
+              <w:t>δ</w:t>
+            </w:r>
+            <w:r>
+              <w:rPr>
+                <w:sz w:val="28"/>
+                <w:szCs w:val="28"/>
+                <w:lang w:val="el-GR"/>
+              </w:rPr>
+              <w:t xml:space="preserve">ημιούργησε </w:t>
+            </w:r>
+            <w:r>
+              <w:rPr>
+                <w:sz w:val="28"/>
+                <w:szCs w:val="28"/>
+                <w:lang w:val="el-GR"/>
+              </w:rPr>
+              <w:t xml:space="preserve">νέο </w:t>
+            </w:r>
+            <w:r>
+              <w:rPr>
+                <w:sz w:val="28"/>
+                <w:szCs w:val="28"/>
+                <w:lang w:val="el-GR"/>
+              </w:rPr>
+              <w:t>μήνυμα</w:t>
+            </w:r>
+            <w:r>
+              <w:rPr>
+                <w:sz w:val="28"/>
+                <w:szCs w:val="28"/>
+                <w:lang w:val="el-GR"/>
+              </w:rPr>
+              <w:t>(</w:t>
+            </w:r>
+            <w:r>
+              <w:rPr>
+                <w:sz w:val="28"/>
+                <w:szCs w:val="28"/>
+              </w:rPr>
+              <w:t>new</w:t>
+            </w:r>
+            <w:r>
+              <w:rPr>
+                <w:sz w:val="28"/>
+                <w:szCs w:val="28"/>
+                <w:lang w:val="el-GR"/>
+              </w:rPr>
+              <w:t xml:space="preserve"> </w:t>
+            </w:r>
+            <w:r>
+              <w:rPr>
+                <w:sz w:val="28"/>
+                <w:szCs w:val="28"/>
+              </w:rPr>
+              <w:t>message</w:t>
+            </w:r>
+            <w:r>
+              <w:rPr>
+                <w:sz w:val="28"/>
+                <w:szCs w:val="28"/>
+                <w:lang w:val="el-GR"/>
+              </w:rPr>
+              <w:t xml:space="preserve">) </w:t>
+            </w:r>
+            <w:r>
+              <w:rPr>
+                <w:sz w:val="28"/>
+                <w:szCs w:val="28"/>
+                <w:lang w:val="el-GR"/>
+              </w:rPr>
+              <w:t>με τα π</w:t>
+            </w:r>
+            <w:r>
+              <w:rPr>
+                <w:sz w:val="28"/>
+                <w:szCs w:val="28"/>
+                <w:lang w:val="el-GR"/>
+              </w:rPr>
+              <w:t>ε</w:t>
+            </w:r>
+            <w:r>
+              <w:rPr>
+                <w:sz w:val="28"/>
+                <w:szCs w:val="28"/>
+                <w:lang w:val="el-GR"/>
+              </w:rPr>
+              <w:t>δία</w:t>
+            </w:r>
+          </w:p>
+          <w:p>
+            <w:pPr>
+              <w:spacing w:after="60" w:line="259" w:lineRule="auto"/>
+              <w:rPr>
+                <w:sz w:val="28"/>
+                <w:szCs w:val="28"/>
+                <w:lang w:val="el-GR"/>
+              </w:rPr>
+            </w:pPr>
             <w:r>
               <w:rPr>
                 <w:b/>
@@ -809,70 +1012,77 @@
               </w:rPr>
               <w:t xml:space="preserve"> </w:t>
             </w:r>
-            <w:r>
-              <w:rPr>
-                <w:sz w:val="28"/>
-                <w:szCs w:val="28"/>
-              </w:rPr>
-              <w:t>aristos</w:t>
-            </w:r>
-            <w:r>
+            <w:hyperlink r:id="rId6" w:history="1">
+              <w:r>
+                <w:rPr>
+                  <w:rStyle w:val="Hyperlink"/>
+                  <w:sz w:val="28"/>
+                  <w:szCs w:val="28"/>
+                </w:rPr>
+                <w:t>aristos</w:t>
+              </w:r>
+              <w:r>
+                <w:rPr>
+                  <w:rStyle w:val="Hyperlink"/>
+                  <w:sz w:val="28"/>
+                  <w:szCs w:val="28"/>
+                  <w:lang w:val="el-GR"/>
+                </w:rPr>
+                <w:t>.</w:t>
+              </w:r>
+              <w:r>
+                <w:rPr>
+                  <w:rStyle w:val="Hyperlink"/>
+                  <w:sz w:val="28"/>
+                  <w:szCs w:val="28"/>
+                </w:rPr>
+                <w:t>aresti</w:t>
+              </w:r>
+              <w:r>
+                <w:rPr>
+                  <w:rStyle w:val="Hyperlink"/>
+                  <w:sz w:val="28"/>
+                  <w:szCs w:val="28"/>
+                  <w:lang w:val="el-GR"/>
+                </w:rPr>
+                <w:t>@</w:t>
+              </w:r>
+              <w:r>
+                <w:rPr>
+                  <w:rStyle w:val="Hyperlink"/>
+                  <w:sz w:val="28"/>
+                  <w:szCs w:val="28"/>
+                </w:rPr>
+                <w:t>gmail</w:t>
+              </w:r>
+              <w:r>
+                <w:rPr>
+                  <w:rStyle w:val="Hyperlink"/>
+                  <w:sz w:val="28"/>
+                  <w:szCs w:val="28"/>
+                  <w:lang w:val="el-GR"/>
+                </w:rPr>
+                <w:t>.</w:t>
+              </w:r>
+              <w:r>
+                <w:rPr>
+                  <w:rStyle w:val="Hyperlink"/>
+                  <w:sz w:val="28"/>
+                  <w:szCs w:val="28"/>
+                </w:rPr>
+                <w:t>com</w:t>
+              </w:r>
+            </w:hyperlink>
+          </w:p>
+          <w:p>
+            <w:pPr>
+              <w:spacing w:after="60" w:line="259" w:lineRule="auto"/>
               <w:rPr>
                 <w:sz w:val="28"/>
                 <w:szCs w:val="28"/>
                 <w:lang w:val="el-GR"/>
               </w:rPr>
-              <w:t>.</w:t>
-            </w:r>
-            <w:proofErr w:type="spellStart"/>
-            <w:r>
-              <w:rPr>
-                <w:sz w:val="28"/>
-                <w:szCs w:val="28"/>
-              </w:rPr>
-              <w:t>aresti</w:t>
-            </w:r>
-            <w:proofErr w:type="spellEnd"/>
-            <w:r>
-              <w:rPr>
-                <w:sz w:val="28"/>
-                <w:szCs w:val="28"/>
-                <w:lang w:val="el-GR"/>
-              </w:rPr>
-              <w:t>@</w:t>
-            </w:r>
-            <w:proofErr w:type="spellStart"/>
-            <w:r>
-              <w:rPr>
-                <w:sz w:val="28"/>
-                <w:szCs w:val="28"/>
-              </w:rPr>
-              <w:t>gmail</w:t>
-            </w:r>
-            <w:proofErr w:type="spellEnd"/>
-            <w:r>
-              <w:rPr>
-                <w:sz w:val="28"/>
-                <w:szCs w:val="28"/>
-                <w:lang w:val="el-GR"/>
-              </w:rPr>
-              <w:t>.</w:t>
-            </w:r>
-            <w:r>
-              <w:rPr>
-                <w:sz w:val="28"/>
-                <w:szCs w:val="28"/>
-              </w:rPr>
-              <w:t>com</w:t>
-            </w:r>
-            <w:r>
-              <w:rPr>
-                <w:sz w:val="28"/>
-                <w:szCs w:val="28"/>
-                <w:lang w:val="el-GR"/>
-              </w:rPr>
-              <w:t xml:space="preserve"> και βάλε στο </w:t>
-            </w:r>
+            </w:pPr>
             <w:r>
               <w:rPr>
                 <w:b/>
@@ -995,11 +1205,78 @@
             </w:pPr>
             <w:r>
               <w:rPr>
+                <w:b/>
+                <w:bCs/>
                 <w:sz w:val="28"/>
                 <w:szCs w:val="28"/>
                 <w:lang w:val="el-GR"/>
               </w:rPr>
-              <w:t>Θέμα: ΦΩΤΟΓΡΑΦΙΕΣ ΣΧΟΛΕΙΟΥ. Κείμενο: «Επισυνάπτω φωτογραφίες από το σχολείο μου.»</w:t>
+              <w:t>Θέμα</w:t>
+            </w:r>
+            <w:r>
+              <w:rPr>
+                <w:b/>
+                <w:bCs/>
+                <w:sz w:val="28"/>
+                <w:szCs w:val="28"/>
+                <w:lang w:val="el-GR"/>
+              </w:rPr>
+              <w:t>(</w:t>
+            </w:r>
+            <w:r>
+              <w:rPr>
+                <w:b/>
+                <w:bCs/>
+                <w:sz w:val="28"/>
+                <w:szCs w:val="28"/>
+              </w:rPr>
+              <w:t>subject)</w:t>
+            </w:r>
+            <w:r>
+              <w:rPr>
+                <w:b/>
+                <w:bCs/>
+                <w:sz w:val="28"/>
+                <w:szCs w:val="28"/>
+                <w:lang w:val="el-GR"/>
+              </w:rPr>
+              <w:t>:</w:t>
+            </w:r>
+            <w:r>
+              <w:rPr>
+                <w:sz w:val="28"/>
+                <w:szCs w:val="28"/>
+                <w:lang w:val="el-GR"/>
+              </w:rPr>
+              <w:t xml:space="preserve"> ΦΩΤΟΓΡΑΦΙΕΣ ΣΧΟΛΕΙΟΥ. </w:t>
+            </w:r>
+          </w:p>
+          <w:p>
+            <w:pPr>
+              <w:spacing w:after="60" w:line="259" w:lineRule="auto"/>
+              <w:rPr>
+                <w:sz w:val="28"/>
+                <w:szCs w:val="28"/>
+                <w:lang w:val="el-GR"/>
+              </w:rPr>
+            </w:pPr>
+            <w:r>
+              <w:rPr>
+                <w:b/>
+                <w:bCs/>
+                <w:sz w:val="28"/>
+                <w:szCs w:val="28"/>
+                <w:lang w:val="el-GR"/>
+              </w:rPr>
+              <w:t>Κείμενο:</w:t>
+            </w:r>
+            <w:r>
+              <w:rPr>
+                <w:sz w:val="28"/>
+                <w:szCs w:val="28"/>
+                <w:lang w:val="el-GR"/>
+              </w:rPr>
+              <w:t xml:space="preserve"> «Επισυνάπτω φωτογραφίες από το σχολείο μου.»</w:t>
             </w:r>
           </w:p>
           <w:p>
@@ -1090,14 +1367,75 @@
                 <w:szCs w:val="28"/>
                 <w:lang w:val="el-GR"/>
               </w:rPr>
-              <w:t xml:space="preserve">Πάτησε </w:t>
-            </w:r>
-            <w:r>
-              <w:rPr>
-                <w:sz w:val="28"/>
-                <w:szCs w:val="28"/>
-              </w:rPr>
-              <w:t>Attach</w:t>
+              <w:t>Πάτησε</w:t>
+            </w:r>
+            <w:r>
+              <w:rPr>
+                <w:sz w:val="28"/>
+                <w:szCs w:val="28"/>
+                <w:lang w:val="el-GR"/>
+              </w:rPr>
+              <w:t xml:space="preserve"> </w:t>
+            </w:r>
+            <w:r>
+              <w:rPr>
+                <w:b/>
+                <w:bCs/>
+                <w:sz w:val="28"/>
+                <w:szCs w:val="28"/>
+              </w:rPr>
+              <w:t>attach</w:t>
+            </w:r>
+            <w:r>
+              <w:rPr>
+                <w:sz w:val="28"/>
+                <w:szCs w:val="28"/>
+                <w:lang w:val="el-GR"/>
+              </w:rPr>
+              <w:t xml:space="preserve"> </w:t>
+            </w:r>
+            <w:r>
+              <w:rPr>
+                <w:b/>
+                <w:bCs/>
+                <w:sz w:val="28"/>
+                <w:szCs w:val="28"/>
+              </w:rPr>
+              <w:drawing>
+                <wp:inline distT="0" distB="0" distL="0" distR="0" wp14:anchorId="1E9C7C43" wp14:editId="04C9B4AF">
+                  <wp:extent cx="268804" cy="276225"/>
+                  <wp:effectExtent l="0" t="0" r="0" b="0"/>
+                  <wp:docPr id="1149619437" name="Picture 1"/>
+                  <wp:cNvGraphicFramePr>
+                    <a:graphicFrameLocks xmlns:a="http://schemas.openxmlformats.org/drawingml/2006/main" noChangeAspect="1"/>
+                  </wp:cNvGraphicFramePr>
+                  <a:graphic xmlns:a="http://schemas.openxmlformats.org/drawingml/2006/main">
+                    <a:graphicData uri="http://schemas.openxmlformats.org/drawingml/2006/picture">
+                      <pic:pic xmlns:pic="http://schemas.openxmlformats.org/drawingml/2006/picture">
+                        <pic:nvPicPr>
+                          <pic:cNvPr id="1149619437" name=""/>
+                          <pic:cNvPicPr/>
+                        </pic:nvPicPr>
+                        <pic:blipFill>
+                          <a:blip r:embed="rId7"/>
+                          <a:stretch>
+                            <a:fillRect/>
+                          </a:stretch>
+                        </pic:blipFill>
+                        <pic:spPr>
+                          <a:xfrm>
+                            <a:off x="0" y="0"/>
+                            <a:ext cx="273805" cy="281364"/>
+                          </a:xfrm>
+                          <a:prstGeom prst="rect">
+                            <a:avLst/>
+                          </a:prstGeom>
+                        </pic:spPr>
+                      </pic:pic>
+                    </a:graphicData>
+                  </a:graphic>
+                </wp:inline>
+              </w:drawing>
             </w:r>
             <w:r>
               <w:rPr>
@@ -1186,6 +1524,8 @@
             </w:r>
             <w:r>
               <w:rPr>
+                <w:b/>
+                <w:bCs/>
                 <w:sz w:val="28"/>
                 <w:szCs w:val="28"/>
               </w:rPr>
@@ -1291,11 +1631,21 @@
             </w:pPr>
             <w:r>
               <w:rPr>
+                <w:b/>
+                <w:bCs/>
                 <w:sz w:val="28"/>
                 <w:szCs w:val="28"/>
                 <w:lang w:val="el-GR"/>
               </w:rPr>
-              <w:t>Άνοιξε το μήνυμα με θέμα ΦΩΤΟΓΡΑΦΙΕΣ ΣΧΟΛΕΙΟΥ που έλαβες από συμμαθητή/</w:t>
+              <w:t>Άνοιξε το μήνυμα</w:t>
+            </w:r>
+            <w:r>
+              <w:rPr>
+                <w:sz w:val="28"/>
+                <w:szCs w:val="28"/>
+                <w:lang w:val="el-GR"/>
+              </w:rPr>
+              <w:t xml:space="preserve"> με θέμα ΦΩΤΟΓΡΑΦΙΕΣ ΣΧΟΛΕΙΟΥ που έλαβες από συμμαθητή/</w:t>
             </w:r>
             <w:proofErr w:type="spellStart"/>
             <w:r>
@@ -1394,6 +1744,8 @@
             </w:r>
             <w:r>
               <w:rPr>
+                <w:b/>
+                <w:bCs/>
                 <w:sz w:val="28"/>
                 <w:szCs w:val="28"/>
               </w:rPr>
@@ -1401,6 +1753,8 @@
             </w:r>
             <w:r>
               <w:rPr>
+                <w:b/>
+                <w:bCs/>
                 <w:sz w:val="28"/>
                 <w:szCs w:val="28"/>
                 <w:lang w:val="el-GR"/>
@@ -1409,6 +1763,8 @@
             </w:r>
             <w:r>
               <w:rPr>
+                <w:b/>
+                <w:bCs/>
                 <w:sz w:val="28"/>
                 <w:szCs w:val="28"/>
               </w:rPr>
@@ -1569,6 +1925,7 @@
                 <w:sz w:val="28"/>
                 <w:szCs w:val="28"/>
               </w:rPr>
+              <w:lastRenderedPageBreak/>
               <w:t xml:space="preserve">☐ </w:t>
             </w:r>
             <w:proofErr w:type="spellStart"/>
@@ -1905,7 +2262,6 @@
           <w:szCs w:val="28"/>
           <w:lang w:val="el-GR"/>
         </w:rPr>
-        <w:lastRenderedPageBreak/>
         <w:t xml:space="preserve">Ασφάλεια: </w:t>
       </w:r>
       <w:r>
@@ -14591,6 +14947,29 @@
       </w:tcPr>
     </w:tblStylePr>
   </w:style>
+  <w:style w:type="character" w:styleId="Hyperlink">
+    <w:name w:val="Hyperlink"/>
+    <w:basedOn w:val="DefaultParagraphFont"/>
+    <w:uiPriority w:val="99"/>
+    <w:unhideWhenUsed/>
+    <w:rsid w:val="00FA488D"/>
+    <w:rPr>
+      <w:color w:val="0000FF" w:themeColor="hyperlink"/>
+      <w:u w:val="single"/>
+    </w:rPr>
+  </w:style>
+  <w:style w:type="character" w:styleId="UnresolvedMention">
+    <w:name w:val="Unresolved Mention"/>
+    <w:basedOn w:val="DefaultParagraphFont"/>
+    <w:uiPriority w:val="99"/>
+    <w:semiHidden/>
+    <w:unhideWhenUsed/>
+    <w:rsid w:val="00FA488D"/>
+    <w:rPr>
+      <w:color w:val="605E5C"/>
+      <w:shd w:val="clear" w:color="auto" w:fill="E1DFDD"/>
+    </w:rPr>
+  </w:style>
 </w:styles>
 </file>
 

</xml_diff>